<commit_message>
Add academic terms and application officer and activity options
</commit_message>
<xml_diff>
--- a/assets/成果書模板_已標記.docx
+++ b/assets/成果書模板_已標記.docx
@@ -46,16 +46,18 @@
         <w:t>東大學</w:t>
       </w:r>
       <w:r>
+        <w:t>{{</w:t>
+      </w:r>
+      <w:r>
         <w:rPr>
-          <w:rFonts w:ascii="標楷體" w:eastAsia="標楷體" w:hAnsi="標楷體" w:cs="標楷體"/>
-          <w:b/>
-          <w:bCs/>
-          <w:sz w:val="32"/>
-          <w:szCs w:val="32"/>
-          <w:u w:val="single"/>
+          <w:rFonts w:hint="eastAsia"/>
         </w:rPr>
-        <w:t>114</w:t>
+        <w:t>學年度</w:t>
       </w:r>
+      <w:r>
+        <w:t>}}</w:t>
+      </w:r>
+      <w:proofErr w:type="gramStart"/>
       <w:r>
         <w:rPr>
           <w:rFonts w:ascii="標楷體" w:eastAsia="標楷體" w:hAnsi="標楷體" w:cs="標楷體"/>
@@ -66,16 +68,18 @@
         </w:rPr>
         <w:t>學年度第</w:t>
       </w:r>
+      <w:proofErr w:type="gramEnd"/>
+      <w:r>
+        <w:t>{{</w:t>
+      </w:r>
       <w:r>
         <w:rPr>
-          <w:rFonts w:ascii="標楷體" w:eastAsia="標楷體" w:hAnsi="標楷體" w:cs="標楷體" w:hint="eastAsia"/>
-          <w:b/>
-          <w:bCs/>
-          <w:sz w:val="32"/>
-          <w:szCs w:val="32"/>
-          <w:u w:val="single"/>
+          <w:rFonts w:hint="eastAsia"/>
         </w:rPr>
-        <w:t>二</w:t>
+        <w:t>學期</w:t>
+      </w:r>
+      <w:r>
+        <w:t>}}</w:t>
       </w:r>
       <w:r>
         <w:rPr>
@@ -1951,47 +1955,52 @@
                 <w:noProof/>
               </w:rPr>
               <w:drawing>
-                <wp:anchor distT="114300" distB="114300" distL="114300" distR="114300" simplePos="0" relativeHeight="251658240" behindDoc="0" locked="0" layoutInCell="1" hidden="0" allowOverlap="1" wp14:anchorId="14A955B2" wp14:editId="3F495AFE">
-                  <wp:simplePos x="0" y="0"/>
-                  <wp:positionH relativeFrom="column">
-                    <wp:posOffset>176213</wp:posOffset>
-                  </wp:positionH>
-                  <wp:positionV relativeFrom="paragraph">
-                    <wp:posOffset>114300</wp:posOffset>
-                  </wp:positionV>
-                  <wp:extent cx="1200150" cy="609600"/>
-                  <wp:effectExtent l="0" t="0" r="0" b="0"/>
-                  <wp:wrapTopAndBottom distT="114300" distB="114300"/>
-                  <wp:docPr id="2063" name="image4.png"/>
-                  <wp:cNvGraphicFramePr/>
+                <wp:inline distT="0" distB="0" distL="0" distR="0" wp14:anchorId="515A720B" wp14:editId="6F83F067">
+                  <wp:extent cx="1538605" cy="700405"/>
+                  <wp:effectExtent l="0" t="0" r="0" b="4445"/>
+                  <wp:docPr id="1" name="圖片 1"/>
+                  <wp:cNvGraphicFramePr>
+                    <a:graphicFrameLocks xmlns:a="http://schemas.openxmlformats.org/drawingml/2006/main" noChangeAspect="1"/>
+                  </wp:cNvGraphicFramePr>
                   <a:graphic xmlns:a="http://schemas.openxmlformats.org/drawingml/2006/main">
                     <a:graphicData uri="http://schemas.openxmlformats.org/drawingml/2006/picture">
                       <pic:pic xmlns:pic="http://schemas.openxmlformats.org/drawingml/2006/picture">
                         <pic:nvPicPr>
-                          <pic:cNvPr id="0" name="image4.png"/>
-                          <pic:cNvPicPr preferRelativeResize="0"/>
+                          <pic:cNvPr id="0" name="Picture 1"/>
+                          <pic:cNvPicPr>
+                            <a:picLocks noChangeAspect="1" noChangeArrowheads="1"/>
+                          </pic:cNvPicPr>
                         </pic:nvPicPr>
                         <pic:blipFill>
-                          <a:blip r:embed="rId8"/>
-                          <a:srcRect t="13393" b="8436"/>
+                          <a:blip r:embed="rId8" cstate="print">
+                            <a:extLst>
+                              <a:ext uri="{28A0092B-C50C-407E-A947-70E740481C1C}">
+                                <a14:useLocalDpi xmlns:a14="http://schemas.microsoft.com/office/drawing/2010/main" val="0"/>
+                              </a:ext>
+                            </a:extLst>
+                          </a:blip>
+                          <a:srcRect/>
                           <a:stretch>
                             <a:fillRect/>
                           </a:stretch>
                         </pic:blipFill>
-                        <pic:spPr>
+                        <pic:spPr bwMode="auto">
                           <a:xfrm>
                             <a:off x="0" y="0"/>
-                            <a:ext cx="1200150" cy="609600"/>
+                            <a:ext cx="1538605" cy="700405"/>
                           </a:xfrm>
                           <a:prstGeom prst="rect">
                             <a:avLst/>
                           </a:prstGeom>
-                          <a:ln/>
+                          <a:noFill/>
+                          <a:ln>
+                            <a:noFill/>
+                          </a:ln>
                         </pic:spPr>
                       </pic:pic>
                     </a:graphicData>
                   </a:graphic>
-                </wp:anchor>
+                </wp:inline>
               </w:drawing>
             </w:r>
           </w:p>
@@ -3131,6 +3140,7 @@
   <w:style w:type="character" w:default="1" w:styleId="a0">
     <w:name w:val="Default Paragraph Font"/>
     <w:uiPriority w:val="1"/>
+    <w:semiHidden/>
     <w:unhideWhenUsed/>
   </w:style>
   <w:style w:type="table" w:default="1" w:styleId="a1">

</xml_diff>